<commit_message>
Add report for Praktikum Mandiri 9: Klasifikasi Dataset Cancer dengan Naive Bayes
- Implemented Naive Bayes algorithm for cancer dataset classification
- Included data exploration, preprocessing, model building, and evaluation
- Added visualizations for data distribution and correlation
- Provided detailed analysis of model performance and confusion matrix
- Suggested future improvements and feature selection techniques
</commit_message>
<xml_diff>
--- a/pertemuan7/Report/Raffa Yuda Pratama_0110224081_LaporanPraktikumMandiri7.docx
+++ b/pertemuan7/Report/Raffa Yuda Pratama_0110224081_LaporanPraktikumMandiri7.docx
@@ -6059,7 +6059,7 @@
           <w:rPr>
             <w:rStyle w:val="Hyperlink"/>
           </w:rPr>
-          <w:t>https://github.com/raffayuda/Machine-Learning/blob/main/pertemuan6/Notebook/praktikum/praktikum6.ipynb</w:t>
+          <w:t>https://github.com/raffayuda/Machine-Learning/blob/main/pertemuan7/Notebook/praktikum/praktikum7_apel.ipynb</w:t>
         </w:r>
       </w:hyperlink>
     </w:p>
@@ -6069,7 +6069,8 @@
         <w:spacing w:before="142" w:line="259" w:lineRule="auto"/>
         <w:ind w:left="383" w:right="2404"/>
         <w:rPr>
-          <w:rStyle w:val="Hyperlink"/>
+          <w:color w:val="0000FF" w:themeColor="hyperlink"/>
+          <w:u w:val="single"/>
         </w:rPr>
       </w:pPr>
       <w:r>
@@ -6095,46 +6096,7 @@
           <w:rPr>
             <w:rStyle w:val="Hyperlink"/>
           </w:rPr>
-          <w:t>https://github.com/raffayuda/Machine-Learning/blob/main/pertemuan6/Notebook/tugas/mandiri6.ipynb</w:t>
-        </w:r>
-      </w:hyperlink>
-    </w:p>
-    <w:p>
-      <w:pPr>
-        <w:pStyle w:val="BodyText"/>
-        <w:spacing w:before="142" w:line="259" w:lineRule="auto"/>
-        <w:ind w:left="383" w:right="2404"/>
-        <w:rPr>
-          <w:lang w:val="en-US"/>
-        </w:rPr>
-      </w:pPr>
-      <w:r>
-        <w:rPr>
-          <w:lang w:val="en-US"/>
-        </w:rPr>
-        <w:t xml:space="preserve">Link </w:t>
-      </w:r>
-      <w:proofErr w:type="gramStart"/>
-      <w:r>
-        <w:rPr>
-          <w:lang w:val="en-US"/>
-        </w:rPr>
-        <w:t>Kaggle :</w:t>
-      </w:r>
-      <w:proofErr w:type="gramEnd"/>
-      <w:r>
-        <w:rPr>
-          <w:lang w:val="en-US"/>
-        </w:rPr>
-        <w:t xml:space="preserve"> </w:t>
-      </w:r>
-      <w:hyperlink r:id="rId16" w:history="1">
-        <w:r>
-          <w:rPr>
-            <w:rStyle w:val="Hyperlink"/>
-            <w:lang w:val="en-US"/>
-          </w:rPr>
-          <w:t>https://www.kaggle.com/datasets/balaka18/email-spam-classification-dataset-csv</w:t>
+          <w:t>https://github.com/raffayuda/Machine-Learning/blob/main/pertemuan7/Notebook/tugas/mandiri7.ipynb</w:t>
         </w:r>
       </w:hyperlink>
     </w:p>

</xml_diff>